<commit_message>
ajout voca; créa "pron"
</commit_message>
<xml_diff>
--- a/Olena_L1/Corrections nooj proposées:typo poly.docx
+++ b/Olena_L1/Corrections nooj proposées:typo poly.docx
@@ -396,6 +396,166 @@
         <w:t xml:space="preserve">? </w:t>
       </w:r>
     </w:p>
+    <w:p>
+      <w:pPr>
+        <w:rPr>
+          <w:lang w:val="uk-UA"/>
+        </w:rPr>
+      </w:pPr>
+    </w:p>
+    <w:p>
+      <w:pPr>
+        <w:rPr>
+          <w:lang w:val="uk-UA"/>
+        </w:rPr>
+      </w:pPr>
+    </w:p>
+    <w:p>
+      <w:r>
+        <w:rPr>
+          <w:lang w:val="uk-UA"/>
+        </w:rPr>
+        <w:t xml:space="preserve">Я </w:t>
+      </w:r>
+      <w:proofErr w:type="spellStart"/>
+      <w:r>
+        <w:rPr>
+          <w:lang w:val="uk-UA"/>
+        </w:rPr>
+        <w:t>студе́нка</w:t>
+      </w:r>
+      <w:proofErr w:type="spellEnd"/>
+      <w:r>
+        <w:rPr>
+          <w:lang w:val="uk-UA"/>
+        </w:rPr>
+        <w:t xml:space="preserve"> </w:t>
+      </w:r>
+      <w:r>
+        <w:rPr>
+          <w:lang w:val="uk-UA"/>
+        </w:rPr>
+        <w:t xml:space="preserve"> </w:t>
+      </w:r>
+      <w:r>
+        <w:rPr>
+          <w:lang w:val="uk-UA"/>
+        </w:rPr>
+        <w:t xml:space="preserve"> -&gt; Я </w:t>
+      </w:r>
+      <w:proofErr w:type="spellStart"/>
+      <w:r>
+        <w:rPr>
+          <w:lang w:val="uk-UA"/>
+        </w:rPr>
+        <w:t>студе́нтка</w:t>
+      </w:r>
+      <w:proofErr w:type="spellEnd"/>
+      <w:r>
+        <w:rPr>
+          <w:lang w:val="uk-UA"/>
+        </w:rPr>
+        <w:t xml:space="preserve">  </w:t>
+      </w:r>
+    </w:p>
+    <w:p/>
+    <w:p>
+      <w:r>
+        <w:t xml:space="preserve">Questions : </w:t>
+      </w:r>
+      <w:r>
+        <w:br/>
+      </w:r>
+      <w:r>
+        <w:br/>
+      </w:r>
+      <w:proofErr w:type="spellStart"/>
+      <w:proofErr w:type="gramStart"/>
+      <w:r>
+        <w:t>вивчати,VERB</w:t>
+      </w:r>
+      <w:proofErr w:type="gramEnd"/>
+      <w:r>
+        <w:t>+Pair</w:t>
+      </w:r>
+      <w:proofErr w:type="spellEnd"/>
+      <w:r>
+        <w:t>="</w:t>
+      </w:r>
+      <w:proofErr w:type="spellStart"/>
+      <w:r>
+        <w:t>вивчати</w:t>
+      </w:r>
+      <w:proofErr w:type="spellEnd"/>
+      <w:r>
+        <w:t>/</w:t>
+      </w:r>
+      <w:proofErr w:type="spellStart"/>
+      <w:r>
+        <w:t>вивчити</w:t>
+      </w:r>
+      <w:proofErr w:type="spellEnd"/>
+      <w:r>
+        <w:t>"+FLX=ЧИТАТИ</w:t>
+      </w:r>
+      <w:r>
+        <w:t xml:space="preserve"> </w:t>
+      </w:r>
+      <w:r>
+        <w:br/>
+      </w:r>
+      <w:r>
+        <w:br/>
+      </w:r>
+      <w:proofErr w:type="spellStart"/>
+      <w:r>
+        <w:t>вивчити</w:t>
+      </w:r>
+      <w:proofErr w:type="spellEnd"/>
+      <w:r>
+        <w:t xml:space="preserve"> n’a pas son entrée à lui (pourquoi ?)</w:t>
+      </w:r>
+    </w:p>
+    <w:p/>
+    <w:p>
+      <w:r>
+        <w:t xml:space="preserve">Idem pour </w:t>
+      </w:r>
+      <w:proofErr w:type="spellStart"/>
+      <w:r>
+        <w:t>зрозуміти</w:t>
+      </w:r>
+      <w:proofErr w:type="spellEnd"/>
+      <w:r>
+        <w:t xml:space="preserve"> </w:t>
+      </w:r>
+    </w:p>
+    <w:p>
+      <w:r>
+        <w:lastRenderedPageBreak/>
+        <w:br/>
+      </w:r>
+      <w:r>
+        <w:br/>
+      </w:r>
+      <w:proofErr w:type="gramStart"/>
+      <w:r>
+        <w:t>розуміти,VERB</w:t>
+      </w:r>
+      <w:proofErr w:type="gramEnd"/>
+      <w:r>
+        <w:t>+Pair="розуміти/зрозуміти"+FLX=ЧИТАТИ+DRV=</w:t>
+      </w:r>
+      <w:proofErr w:type="gramStart"/>
+      <w:r>
+        <w:t>З:ЧИТАТИ</w:t>
+      </w:r>
+      <w:proofErr w:type="gramEnd"/>
+      <w:r>
+        <w:t>_PF</w:t>
+      </w:r>
+    </w:p>
+    <w:p/>
     <w:sectPr>
       <w:pgSz w:w="11906" w:h="16838"/>
       <w:pgMar w:top="1417" w:right="1417" w:bottom="1417" w:left="1417" w:header="708" w:footer="708" w:gutter="0"/>

</xml_diff>